<commit_message>
Commit 2. Fecha de entrega
se estableció una fecha de entrega de avances del proyecto
</commit_message>
<xml_diff>
--- a/Sexta semana de Técnicas de Inteligencia Artificial.docx
+++ b/Sexta semana de Técnicas de Inteligencia Artificial.docx
@@ -48,6 +48,35 @@
           <w:rtl w:val="0"/>
         </w:rPr>
         <w:t xml:space="preserve"> El dia Martes 29 de septiembre se realizó una actividad orientada a codificar unos ejercicios en google collab.</w:t>
+      </w:r>
+    </w:p>
+    <w:p>
+      <w:pPr>
+        <w:rPr/>
+      </w:pPr>
+      <w:r>
+        <w:rPr>
+          <w:rtl w:val="0"/>
+        </w:rPr>
+      </w:r>
+    </w:p>
+    <w:p>
+      <w:pPr>
+        <w:rPr/>
+      </w:pPr>
+      <w:r>
+        <w:rPr>
+          <w:b w:val="1"/>
+          <w:bCs w:val="1"/>
+          <w:rtl w:val="0"/>
+        </w:rPr>
+        <w:t xml:space="preserve">Actividad 2</w:t>
+      </w:r>
+      <w:r>
+        <w:rPr>
+          <w:rtl w:val="0"/>
+        </w:rPr>
+        <w:t xml:space="preserve">: El dia Jueves 1 de octubre, se estableció una fecha para entregar un avance del proyecto</w:t>
       </w:r>
     </w:p>
     <w:sectPr>

</xml_diff>

<commit_message>
Commit 3. Pruebas en Linux
hice unas pruebas con la aplicación del dron en Linux
</commit_message>
<xml_diff>
--- a/Sexta semana de Técnicas de Inteligencia Artificial.docx
+++ b/Sexta semana de Técnicas de Inteligencia Artificial.docx
@@ -76,7 +76,36 @@
         <w:rPr>
           <w:rtl w:val="0"/>
         </w:rPr>
-        <w:t xml:space="preserve">: El dia Jueves 1 de octubre, se estableció una fecha para entregar un avance del proyecto</w:t>
+        <w:t xml:space="preserve">: El dia Jueves 1 de octubre, se estableció una fecha para entregar un avance del proyecto.</w:t>
+      </w:r>
+    </w:p>
+    <w:p>
+      <w:pPr>
+        <w:rPr/>
+      </w:pPr>
+      <w:r>
+        <w:rPr>
+          <w:rtl w:val="0"/>
+        </w:rPr>
+      </w:r>
+    </w:p>
+    <w:p>
+      <w:pPr>
+        <w:rPr/>
+      </w:pPr>
+      <w:r>
+        <w:rPr>
+          <w:b w:val="1"/>
+          <w:bCs w:val="1"/>
+          <w:rtl w:val="0"/>
+        </w:rPr>
+        <w:t xml:space="preserve">Actividad 3: </w:t>
+      </w:r>
+      <w:r>
+        <w:rPr>
+          <w:rtl w:val="0"/>
+        </w:rPr>
+        <w:t xml:space="preserve">hice unas cuantas pruebas en el avance que voy a entregar el dia lunes 5 de octubre.</w:t>
       </w:r>
     </w:p>
     <w:sectPr>

</xml_diff>